<commit_message>
feat(seo): add custom WordPress Content SEO optimization plugin feature across website, PDFs, and Word documents
</commit_message>
<xml_diff>
--- a/assets/docs/CV-Le-Tran-Thanh-Uyen.docx
+++ b/assets/docs/CV-Le-Tran-Thanh-Uyen.docx
@@ -178,7 +178,7 @@
           <w:color w:val="1F2937"/>
           <w:sz w:val="22"/>
         </w:rPr>
-        <w:t>WordPress chuyên sâu, Elementor, WooCommerce, tối ưu mã nguồn HTML5, CSS3, JavaScript, PHP, MySQL, cấu hình Hosting/cPanel, Cloudflare, SSL.</w:t>
+        <w:t>WordPress chuyên sâu, Elementor, WooCommerce, tự code WordPress Plugin tùy biến tối ưu Content SEO &amp; Schema JSON-LD, tối ưu mã nguồn HTML5, CSS3, JavaScript, PHP, MySQL, Hosting/cPanel, Cloudflare.</w:t>
       </w:r>
     </w:p>
     <w:p>
@@ -266,6 +266,29 @@
           <w:sz w:val="22"/>
         </w:rPr>
         <w:t xml:space="preserve">   (2022 – Hiện tại)</w:t>
+      </w:r>
+    </w:p>
+    <w:p>
+      <w:pPr>
+        <w:pStyle w:val="ListBullet"/>
+        <w:spacing w:before="40" w:after="60" w:line="288" w:lineRule="auto"/>
+      </w:pPr>
+      <w:r>
+        <w:rPr>
+          <w:rFonts w:ascii="Arial" w:hAnsi="Arial"/>
+          <w:b/>
+          <w:color w:val="1F2937"/>
+          <w:sz w:val="22"/>
+        </w:rPr>
+        <w:t xml:space="preserve">Phát triển công cụ &amp; Tối ưu SEO: </w:t>
+      </w:r>
+      <w:r>
+        <w:rPr>
+          <w:rFonts w:ascii="Arial" w:hAnsi="Arial"/>
+          <w:color w:val="1F2937"/>
+          <w:sz w:val="22"/>
+        </w:rPr>
+        <w:t>Tự lập trình WordPress Plugin tối ưu Content SEO (chấm điểm on-page theo thời gian thực, tự sinh mục lục TOC và chèn Schema FAQ), giúp chuẩn hóa 100% bài viết và đưa hơn 30+ từ khóa vào Top 5 Google.</w:t>
       </w:r>
     </w:p>
     <w:p>

</xml_diff>

<commit_message>
fix(projects): update Sàn Thẩm Mỹ tech stack to Laravel across web, PDFs, and Word documents
</commit_message>
<xml_diff>
--- a/assets/docs/CV-Le-Tran-Thanh-Uyen.docx
+++ b/assets/docs/CV-Le-Tran-Thanh-Uyen.docx
@@ -303,7 +303,7 @@
           <w:color w:val="1F2937"/>
           <w:sz w:val="22"/>
         </w:rPr>
-        <w:t xml:space="preserve">Triển khai &amp; Vận hành Website: </w:t>
+        <w:t xml:space="preserve">Triển khai &amp; Vận hành Web WordPress &amp; Laravel: </w:t>
       </w:r>
       <w:r>
         <w:rPr>
@@ -311,7 +311,7 @@
           <w:color w:val="1F2937"/>
           <w:sz w:val="22"/>
         </w:rPr>
-        <w:t>Xây dựng và quản trị hơn 8+ website doanh nghiệp và bán hàng trên nền tảng WordPress. Tối ưu tốc độ tải trang đạt điểm số 90+ trên Google PageSpeed Insights.</w:t>
+        <w:t>Xây dựng và quản trị 8+ website doanh nghiệp trên WordPress và cổng danh bạ Sàn Thẩm Mỹ (santhammy.com) trên Laravel MVC (PHP &amp; MySQL). Tối ưu tốc độ tải trang đạt điểm số 90+ trên Google PageSpeed Insights.</w:t>
       </w:r>
     </w:p>
     <w:p>

</xml_diff>

<commit_message>
feat: add taichinhtaithanh.com Blogspot landing page project and birth date (18/01/1986)
</commit_message>
<xml_diff>
--- a/assets/docs/CV-Le-Tran-Thanh-Uyen.docx
+++ b/assets/docs/CV-Le-Tran-Thanh-Uyen.docx
@@ -61,6 +61,8 @@
                 <w:color w:val="E5E7EB"/>
                 <w:sz w:val="21"/>
               </w:rPr>
+              <w:t>🎂 Ngày sinh: 18/01/1986   |   📍 Địa chỉ: TP. Hồ Chí Minh</w:t>
+              <w:br/>
               <w:t>📞 Điện thoại / Zalo: 0706 700 528   |   ✉️ Email: thanhuyenletran@gmail.com</w:t>
               <w:br/>
               <w:t>🌐 Website Portfolio: https://uyenpoe.github.io/cv-letranthanhuyen/   |   🐙 GitHub: https://github.com/UyenPoe</w:t>
@@ -178,7 +180,7 @@
           <w:color w:val="1F2937"/>
           <w:sz w:val="22"/>
         </w:rPr>
-        <w:t>WordPress chuyên sâu, Elementor, WooCommerce, tự code WordPress Plugin tùy biến tối ưu Content SEO &amp; Schema JSON-LD, tối ưu mã nguồn HTML5, CSS3, JavaScript, PHP, MySQL, Hosting/cPanel, Cloudflare.</w:t>
+        <w:t>WordPress chuyên sâu, Elementor, WooCommerce, Google Blogspot (Custom XML &amp; CRO), tự code WordPress Plugin tùy biến tối ưu Content SEO &amp; Schema JSON-LD, tối ưu mã nguồn HTML5, CSS3, JavaScript, PHP, MySQL, Hosting/cPanel, Cloudflare.</w:t>
       </w:r>
     </w:p>
     <w:p>
@@ -303,7 +305,7 @@
           <w:color w:val="1F2937"/>
           <w:sz w:val="22"/>
         </w:rPr>
-        <w:t xml:space="preserve">Triển khai &amp; Vận hành Web WordPress &amp; Laravel: </w:t>
+        <w:t xml:space="preserve">Triển khai &amp; Vận hành Web WordPress, Laravel &amp; Blogspot: </w:t>
       </w:r>
       <w:r>
         <w:rPr>
@@ -311,7 +313,7 @@
           <w:color w:val="1F2937"/>
           <w:sz w:val="22"/>
         </w:rPr>
-        <w:t>Xây dựng và quản trị 8+ website doanh nghiệp trên WordPress và cổng danh bạ Sàn Thẩm Mỹ (santhammy.com) trên Laravel MVC (PHP &amp; MySQL). Tối ưu tốc độ tải trang đạt điểm số 90+ trên Google PageSpeed Insights.</w:t>
+        <w:t>Xây dựng và quản trị các website doanh nghiệp trên WordPress, hệ thống thương mại &amp; danh bạ trên Laravel MVC (smartphone.taichinhtaithanh.com, santhammy.com), và Landing Page tư vấn tài chính trên Google Blogspot (taichinhtaithanh.com). Tối ưu tốc độ tải trang đạt điểm số 90+ trên Google PageSpeed Insights.</w:t>
       </w:r>
     </w:p>
     <w:p>

</xml_diff>